<commit_message>
Nộp bài báo cáo và bổ sung template
</commit_message>
<xml_diff>
--- a/Bài Báo Cáo.docx
+++ b/Bài Báo Cáo.docx
@@ -575,7 +575,35 @@
                 <w:szCs w:val="28"/>
               </w:rPr>
               <w:tab/>
-              <w:t>: Trần</w:t>
+              <w:t xml:space="preserve">: </w:t>
+            </w:r>
+            <w:r>
+              <w:rPr>
+                <w:rFonts w:cs="Times New Roman"/>
+                <w:b/>
+                <w:sz w:val="28"/>
+                <w:szCs w:val="28"/>
+              </w:rPr>
+              <w:t>Ths</w:t>
+            </w:r>
+            <w:r>
+              <w:rPr>
+                <w:rFonts w:cs="Times New Roman"/>
+                <w:b/>
+                <w:sz w:val="28"/>
+                <w:szCs w:val="28"/>
+                <w:lang w:val="vi-VN"/>
+              </w:rPr>
+              <w:t>.</w:t>
+            </w:r>
+            <w:r>
+              <w:rPr>
+                <w:rFonts w:cs="Times New Roman"/>
+                <w:b/>
+                <w:sz w:val="28"/>
+                <w:szCs w:val="28"/>
+              </w:rPr>
+              <w:t>Trần</w:t>
             </w:r>
             <w:r>
               <w:rPr>
@@ -2728,24 +2756,14 @@
       <w:r>
         <w:t xml:space="preserve">Hình </w:t>
       </w:r>
-      <w:r>
-        <w:fldChar w:fldCharType="begin"/>
-      </w:r>
-      <w:r>
-        <w:instrText xml:space="preserve"> SEQ Hình \* ARABIC </w:instrText>
-      </w:r>
-      <w:r>
-        <w:fldChar w:fldCharType="separate"/>
-      </w:r>
-      <w:r>
-        <w:rPr>
-          <w:noProof/>
-        </w:rPr>
-        <w:t>1</w:t>
-      </w:r>
-      <w:r>
-        <w:fldChar w:fldCharType="end"/>
-      </w:r>
+      <w:fldSimple w:instr=" SEQ Hình \* ARABIC ">
+        <w:r>
+          <w:rPr>
+            <w:noProof/>
+          </w:rPr>
+          <w:t>1</w:t>
+        </w:r>
+      </w:fldSimple>
       <w:r>
         <w:rPr>
           <w:lang w:val="vi-VN"/>
@@ -2905,24 +2923,14 @@
       <w:r>
         <w:t xml:space="preserve">Hình </w:t>
       </w:r>
-      <w:r>
-        <w:fldChar w:fldCharType="begin"/>
-      </w:r>
-      <w:r>
-        <w:instrText xml:space="preserve"> SEQ Hình \* ARABIC </w:instrText>
-      </w:r>
-      <w:r>
-        <w:fldChar w:fldCharType="separate"/>
-      </w:r>
-      <w:r>
-        <w:rPr>
-          <w:noProof/>
-        </w:rPr>
-        <w:t>2</w:t>
-      </w:r>
-      <w:r>
-        <w:fldChar w:fldCharType="end"/>
-      </w:r>
+      <w:fldSimple w:instr=" SEQ Hình \* ARABIC ">
+        <w:r>
+          <w:rPr>
+            <w:noProof/>
+          </w:rPr>
+          <w:t>2</w:t>
+        </w:r>
+      </w:fldSimple>
       <w:r>
         <w:rPr>
           <w:lang w:val="vi-VN"/>
@@ -3064,24 +3072,14 @@
       <w:r>
         <w:t xml:space="preserve">Hình </w:t>
       </w:r>
-      <w:r>
-        <w:fldChar w:fldCharType="begin"/>
-      </w:r>
-      <w:r>
-        <w:instrText xml:space="preserve"> SEQ Hình \* ARABIC </w:instrText>
-      </w:r>
-      <w:r>
-        <w:fldChar w:fldCharType="separate"/>
-      </w:r>
-      <w:r>
-        <w:rPr>
-          <w:noProof/>
-        </w:rPr>
-        <w:t>3</w:t>
-      </w:r>
-      <w:r>
-        <w:fldChar w:fldCharType="end"/>
-      </w:r>
+      <w:fldSimple w:instr=" SEQ Hình \* ARABIC ">
+        <w:r>
+          <w:rPr>
+            <w:noProof/>
+          </w:rPr>
+          <w:t>3</w:t>
+        </w:r>
+      </w:fldSimple>
       <w:r>
         <w:rPr>
           <w:lang w:val="vi-VN"/>
@@ -3156,17 +3154,7 @@
           <w:szCs w:val="26"/>
           <w:lang w:val="vi-VN"/>
         </w:rPr>
-        <w:t xml:space="preserve"> mức </w:t>
-      </w:r>
-      <w:r>
-        <w:rPr>
-          <w:b/>
-          <w:bCs/>
-          <w:sz w:val="26"/>
-          <w:szCs w:val="26"/>
-          <w:lang w:val="vi-VN"/>
-        </w:rPr>
-        <w:t>1</w:t>
+        <w:t xml:space="preserve"> mức 1</w:t>
       </w:r>
     </w:p>
     <w:p>
@@ -3238,24 +3226,14 @@
       <w:r>
         <w:t xml:space="preserve">Hình </w:t>
       </w:r>
-      <w:r>
-        <w:fldChar w:fldCharType="begin"/>
-      </w:r>
-      <w:r>
-        <w:instrText xml:space="preserve"> SEQ Hình \* ARABIC </w:instrText>
-      </w:r>
-      <w:r>
-        <w:fldChar w:fldCharType="separate"/>
-      </w:r>
-      <w:r>
-        <w:rPr>
-          <w:noProof/>
-        </w:rPr>
-        <w:t>4</w:t>
-      </w:r>
-      <w:r>
-        <w:fldChar w:fldCharType="end"/>
-      </w:r>
+      <w:fldSimple w:instr=" SEQ Hình \* ARABIC ">
+        <w:r>
+          <w:rPr>
+            <w:noProof/>
+          </w:rPr>
+          <w:t>4</w:t>
+        </w:r>
+      </w:fldSimple>
       <w:r>
         <w:rPr>
           <w:lang w:val="vi-VN"/>
@@ -3348,17 +3326,7 @@
           <w:szCs w:val="26"/>
           <w:lang w:val="vi-VN"/>
         </w:rPr>
-        <w:t xml:space="preserve"> mức </w:t>
-      </w:r>
-      <w:r>
-        <w:rPr>
-          <w:b/>
-          <w:bCs/>
-          <w:sz w:val="26"/>
-          <w:szCs w:val="26"/>
-          <w:lang w:val="vi-VN"/>
-        </w:rPr>
-        <w:t>2</w:t>
+        <w:t xml:space="preserve"> mức 2</w:t>
       </w:r>
     </w:p>
     <w:p>
@@ -3430,24 +3398,14 @@
       <w:r>
         <w:t xml:space="preserve">Hình </w:t>
       </w:r>
-      <w:r>
-        <w:fldChar w:fldCharType="begin"/>
-      </w:r>
-      <w:r>
-        <w:instrText xml:space="preserve"> SEQ Hình \* ARABIC </w:instrText>
-      </w:r>
-      <w:r>
-        <w:fldChar w:fldCharType="separate"/>
-      </w:r>
-      <w:r>
-        <w:rPr>
-          <w:noProof/>
-        </w:rPr>
-        <w:t>5</w:t>
-      </w:r>
-      <w:r>
-        <w:fldChar w:fldCharType="end"/>
-      </w:r>
+      <w:fldSimple w:instr=" SEQ Hình \* ARABIC ">
+        <w:r>
+          <w:rPr>
+            <w:noProof/>
+          </w:rPr>
+          <w:t>5</w:t>
+        </w:r>
+      </w:fldSimple>
       <w:r>
         <w:rPr>
           <w:lang w:val="vi-VN"/>
@@ -3532,24 +3490,14 @@
       <w:r>
         <w:t xml:space="preserve">Hình </w:t>
       </w:r>
-      <w:r>
-        <w:fldChar w:fldCharType="begin"/>
-      </w:r>
-      <w:r>
-        <w:instrText xml:space="preserve"> SEQ Hình \* ARABIC </w:instrText>
-      </w:r>
-      <w:r>
-        <w:fldChar w:fldCharType="separate"/>
-      </w:r>
-      <w:r>
-        <w:rPr>
-          <w:noProof/>
-        </w:rPr>
-        <w:t>6</w:t>
-      </w:r>
-      <w:r>
-        <w:fldChar w:fldCharType="end"/>
-      </w:r>
+      <w:fldSimple w:instr=" SEQ Hình \* ARABIC ">
+        <w:r>
+          <w:rPr>
+            <w:noProof/>
+          </w:rPr>
+          <w:t>6</w:t>
+        </w:r>
+      </w:fldSimple>
       <w:r>
         <w:rPr>
           <w:lang w:val="vi-VN"/>
@@ -3618,24 +3566,14 @@
       <w:r>
         <w:t xml:space="preserve">Hình </w:t>
       </w:r>
-      <w:r>
-        <w:fldChar w:fldCharType="begin"/>
-      </w:r>
-      <w:r>
-        <w:instrText xml:space="preserve"> SEQ Hình \* ARABIC </w:instrText>
-      </w:r>
-      <w:r>
-        <w:fldChar w:fldCharType="separate"/>
-      </w:r>
-      <w:r>
-        <w:rPr>
-          <w:noProof/>
-        </w:rPr>
-        <w:t>7</w:t>
-      </w:r>
-      <w:r>
-        <w:fldChar w:fldCharType="end"/>
-      </w:r>
+      <w:fldSimple w:instr=" SEQ Hình \* ARABIC ">
+        <w:r>
+          <w:rPr>
+            <w:noProof/>
+          </w:rPr>
+          <w:t>7</w:t>
+        </w:r>
+      </w:fldSimple>
       <w:r>
         <w:rPr>
           <w:lang w:val="vi-VN"/>
@@ -3732,24 +3670,14 @@
       <w:r>
         <w:t xml:space="preserve">Hình </w:t>
       </w:r>
-      <w:r>
-        <w:fldChar w:fldCharType="begin"/>
-      </w:r>
-      <w:r>
-        <w:instrText xml:space="preserve"> SEQ Hình \* ARABIC </w:instrText>
-      </w:r>
-      <w:r>
-        <w:fldChar w:fldCharType="separate"/>
-      </w:r>
-      <w:r>
-        <w:rPr>
-          <w:noProof/>
-        </w:rPr>
-        <w:t>8</w:t>
-      </w:r>
-      <w:r>
-        <w:fldChar w:fldCharType="end"/>
-      </w:r>
+      <w:fldSimple w:instr=" SEQ Hình \* ARABIC ">
+        <w:r>
+          <w:rPr>
+            <w:noProof/>
+          </w:rPr>
+          <w:t>8</w:t>
+        </w:r>
+      </w:fldSimple>
       <w:r>
         <w:rPr>
           <w:lang w:val="vi-VN"/>
@@ -8930,6 +8858,7 @@
   <w:style w:type="character" w:default="1" w:styleId="DefaultParagraphFont">
     <w:name w:val="Default Paragraph Font"/>
     <w:uiPriority w:val="1"/>
+    <w:semiHidden/>
     <w:unhideWhenUsed/>
   </w:style>
   <w:style w:type="table" w:default="1" w:styleId="TableNormal">

</xml_diff>